<commit_message>
Implementing code review changes
</commit_message>
<xml_diff>
--- a/01_Info/MassGIS Framework Grant Discussion Topics.docx
+++ b/01_Info/MassGIS Framework Grant Discussion Topics.docx
@@ -19,7 +19,10 @@
     </w:p>
     <w:p>
       <w:r>
-        <w:t>September 25</w:t>
+        <w:t xml:space="preserve">September </w:t>
+      </w:r>
+      <w:r>
+        <w:t>30</w:t>
       </w:r>
       <w:r>
         <w:t>,</w:t>
@@ -34,7 +37,40 @@
       </w:r>
     </w:p>
     <w:p>
-      <w:r>
+      <w:pPr>
+        <w:rPr>
+          <w:b/>
+          <w:bCs/>
+        </w:rPr>
+      </w:pPr>
+      <w:r>
+        <w:rPr>
+          <w:b/>
+          <w:bCs/>
+        </w:rPr>
+        <w:t>Takeaways</w:t>
+      </w:r>
+    </w:p>
+    <w:p>
+      <w:pPr>
+        <w:rPr>
+          <w:b/>
+          <w:bCs/>
+        </w:rPr>
+      </w:pPr>
+    </w:p>
+    <w:p>
+      <w:pPr>
+        <w:rPr>
+          <w:b/>
+          <w:bCs/>
+        </w:rPr>
+      </w:pPr>
+      <w:r>
+        <w:rPr>
+          <w:b/>
+          <w:bCs/>
+        </w:rPr>
         <w:t>Process Decisions</w:t>
       </w:r>
     </w:p>
@@ -48,7 +84,17 @@
       </w:pPr>
     </w:p>
     <w:p>
-      <w:r>
+      <w:pPr>
+        <w:rPr>
+          <w:b/>
+          <w:bCs/>
+        </w:rPr>
+      </w:pPr>
+      <w:r>
+        <w:rPr>
+          <w:b/>
+          <w:bCs/>
+        </w:rPr>
         <w:t>Land Use Code Decisions</w:t>
       </w:r>
     </w:p>
@@ -135,6 +181,9 @@
       <w:r>
         <w:t xml:space="preserve"> can </w:t>
       </w:r>
+      <w:r>
+        <w:t xml:space="preserve">improve decision making. For example, feedback from other RPAs </w:t>
+      </w:r>
     </w:p>
     <w:p>
       <w:pPr>
@@ -216,6 +265,43 @@
     </w:p>
     <w:p>
       <w:pPr>
+        <w:rPr>
+          <w:b/>
+          <w:bCs/>
+        </w:rPr>
+      </w:pPr>
+      <w:r>
+        <w:rPr>
+          <w:b/>
+          <w:bCs/>
+        </w:rPr>
+        <w:t>Outstanding Questions</w:t>
+      </w:r>
+      <w:r>
+        <w:rPr>
+          <w:b/>
+          <w:bCs/>
+        </w:rPr>
+        <w:t>, Decisions, and Work</w:t>
+      </w:r>
+    </w:p>
+    <w:p>
+      <w:pPr>
+        <w:rPr>
+          <w:i/>
+          <w:iCs/>
+        </w:rPr>
+      </w:pPr>
+      <w:r>
+        <w:rPr>
+          <w:i/>
+          <w:iCs/>
+        </w:rPr>
+        <w:t>General</w:t>
+      </w:r>
+    </w:p>
+    <w:p>
+      <w:pPr>
         <w:pStyle w:val="ListParagraph"/>
         <w:numPr>
           <w:ilvl w:val="0"/>
@@ -223,27 +309,7 @@
         </w:numPr>
       </w:pPr>
       <w:r>
-        <w:t>Deprecated Exempt Use Codes</w:t>
-      </w:r>
-    </w:p>
-    <w:p>
-      <w:r>
-        <w:t>Outstanding Questions and Decisions</w:t>
-      </w:r>
-    </w:p>
-    <w:p>
-      <w:pPr>
-        <w:rPr>
-          <w:i/>
-          <w:iCs/>
-        </w:rPr>
-      </w:pPr>
-      <w:r>
-        <w:rPr>
-          <w:i/>
-          <w:iCs/>
-        </w:rPr>
-        <w:t>General</w:t>
+        <w:t>Guidance from from DLS/BLA on how they evaluate municipal codes that fall into the “DLS Duplicate” category.</w:t>
       </w:r>
     </w:p>
     <w:p>
@@ -255,7 +321,57 @@
         </w:numPr>
       </w:pPr>
       <w:r>
-        <w:t>Guidance from from DLS/BLA on how they evaluate municipal codes that fall into the “DLS Duplicate” category.</w:t>
+        <w:t xml:space="preserve">Several instances where "XXXV" or "Vacant" municipal land use codes are assigned to initial three digit match (e.x. 101V - "Residential Vacant" or "Single Family Vacant" assigned to 101 - "Single Family"). UMDI allocates these to 131 - "Potentially Developable Land". </w:t>
+      </w:r>
+      <w:r>
+        <w:t xml:space="preserve">Do these </w:t>
+      </w:r>
+      <w:r>
+        <w:lastRenderedPageBreak/>
+        <w:t xml:space="preserve">parcels have no structure and that is what makes them “vacant” or is there an existing vacant structure on the parcel? Can we validate this with the </w:t>
+      </w:r>
+      <w:hyperlink r:id="rId5" w:history="1">
+        <w:r>
+          <w:rPr>
+            <w:rStyle w:val="Hyperlink"/>
+          </w:rPr>
+          <w:t>Building Structure</w:t>
+        </w:r>
+      </w:hyperlink>
+      <w:r>
+        <w:t xml:space="preserve"> data layer?</w:t>
+      </w:r>
+    </w:p>
+    <w:p>
+      <w:pPr>
+        <w:pStyle w:val="ListParagraph"/>
+        <w:numPr>
+          <w:ilvl w:val="0"/>
+          <w:numId w:val="1"/>
+        </w:numPr>
+      </w:pPr>
+      <w:r>
+        <w:t xml:space="preserve">After parsing through unique municipal use codes, there are some instances of common municipal use descriptions that do not match the text of any standard code which could become their own code. One example is “Airport.” Unique municipal codes do not follow a clear pattern for this use description. </w:t>
+      </w:r>
+      <w:r>
+        <w:t xml:space="preserve">How is a code with a description like this handled? Is this an example of a unique municipal code that should receive a standard use code? How is that determination made by DLS/BLA? </w:t>
+      </w:r>
+    </w:p>
+    <w:p>
+      <w:pPr>
+        <w:numPr>
+          <w:ilvl w:val="0"/>
+          <w:numId w:val="1"/>
+        </w:numPr>
+      </w:pPr>
+      <w:r>
+        <w:t>Currently, I don't have a process by which an assigned land use code can supersede an initially matched land use code (or even calculate the frequency at which this occurs programmatically). From visual inspection there are instances where this should happen. For example 102I is a municipal code referring to a "Boarding House". It is initially matched to 102 - Condominiums. Text analysis correctly flags it to 121 - "Rooming and Boarding Houses". My initial thought is to leave a column for a "suggested alternative" land use code classification for the initially matched codes. Thoughts?</w:t>
+      </w:r>
+      <w:r>
+        <w:t xml:space="preserve"> </w:t>
+      </w:r>
+      <w:r>
+        <w:t>This also applies to if we want to use UMDI to supersede our codes.</w:t>
       </w:r>
     </w:p>
     <w:p>
@@ -309,8 +425,44 @@
         </w:numPr>
       </w:pPr>
       <w:r>
-        <w:lastRenderedPageBreak/>
-        <w:t>Deprecated Exempt Use Codes</w:t>
+        <w:t xml:space="preserve">Municipalities continue to use deprecated single use codes. Those include. Initial decision was made to crosswalk those deprecated municipal use codes to successor standard use codes. Some of these are more straightforward to crosswalk than others. For example, </w:t>
+      </w:r>
+      <w:r>
+        <w:t>. Others have less clear successors. For example, . How does DLS/BLA handle parcels coded with these deprecated use codes? Is there an appropriate way to crosswalk these codes?</w:t>
+      </w:r>
+    </w:p>
+    <w:p>
+      <w:pPr>
+        <w:pStyle w:val="ListParagraph"/>
+        <w:numPr>
+          <w:ilvl w:val="0"/>
+          <w:numId w:val="1"/>
+        </w:numPr>
+      </w:pPr>
+      <w:r>
+        <w:t>"Office Condominiums" are a common use that are getting allocated to "Residential Condominiums". I feel this is easy enough to hard code (most already belong to the correct one digit code 1, 3, or 4).</w:t>
+      </w:r>
+    </w:p>
+    <w:p>
+      <w:pPr>
+        <w:numPr>
+          <w:ilvl w:val="0"/>
+          <w:numId w:val="1"/>
+        </w:numPr>
+      </w:pPr>
+      <w:r>
+        <w:t>A similar issue arises for "Developable", "Potentially Developable", and "Undevelopable" land. The one digit code usually gives it away; at times there is text that indicates whether its residential (e.x. "res"), commercial, or industrial. Given that there are typically clues, these don't fall into DLS duplicate territory, but I think its something to raise.</w:t>
+      </w:r>
+    </w:p>
+    <w:p>
+      <w:pPr>
+        <w:numPr>
+          <w:ilvl w:val="0"/>
+          <w:numId w:val="1"/>
+        </w:numPr>
+      </w:pPr>
+      <w:r>
+        <w:t>Reviewing codes with ADU indicators (e.x. "in-law") I found a few other terms that could be useful - "auxiliary" and "accessory". The latter is used elsewhere the list of standard codes (106 - "Accessory Land") so I won't use it.</w:t>
       </w:r>
     </w:p>
     <w:p>
@@ -331,106 +483,20 @@
         </w:numPr>
       </w:pPr>
       <w:r>
-        <w:t xml:space="preserve">Running the text analysis on the matched codes hasn't improved the number of matches to UMDI. I'm still working on some crosstabs to better understand why. My initial hunch is because they are using a limited set of standard codes so, structurally, we just wont get a close match (esp. with non-residential codes). </w:t>
-      </w:r>
-    </w:p>
-    <w:p>
-      <w:pPr>
-        <w:numPr>
-          <w:ilvl w:val="0"/>
-          <w:numId w:val="2"/>
-        </w:numPr>
-      </w:pPr>
-      <w:r>
-        <w:t>Currently, I don't have a process by which an assigned land use code can supersede an initially matched land use code (or even calculate the frequency at which this occurs programmatically). From visual inspection there are instances where the this should happen. For example 102I is a municipal code referring to a "Boarding House". It is initially matched to 102 - Condominiums. Text analysis correctly flags it to 121 - "Rooming and Boarding Houses". My initial thought is to leave a column for a "suggested alternative" land use code classification for the initially matched codes. Thoughts?</w:t>
-      </w:r>
-    </w:p>
-    <w:p>
-      <w:pPr>
-        <w:numPr>
-          <w:ilvl w:val="1"/>
-          <w:numId w:val="2"/>
-        </w:numPr>
-      </w:pPr>
-      <w:r>
-        <w:t>This also applies to if we want to use UMDI to supersede our codes.</w:t>
-      </w:r>
-    </w:p>
+        <w:t xml:space="preserve">Running the text analysis on the matched codes hasn't improved the number of matches to UMDI. I'm still working on some crosstabs to better understand why. My initial hunch is </w:t>
+      </w:r>
+      <w:r>
+        <w:lastRenderedPageBreak/>
+        <w:t xml:space="preserve">because they are using a limited set of standard codes so, structurally, we just wont get a close match (esp. with non-residential codes). </w:t>
+      </w:r>
+    </w:p>
+    <w:p/>
     <w:p>
       <w:r>
         <w:br/>
       </w:r>
       <w:r>
         <w:br/>
-        <w:t>Additional Observations:</w:t>
-      </w:r>
-    </w:p>
-    <w:p>
-      <w:pPr>
-        <w:numPr>
-          <w:ilvl w:val="0"/>
-          <w:numId w:val="3"/>
-        </w:numPr>
-      </w:pPr>
-      <w:r>
-        <w:t>Several instances where "XXXV" or "Vacant" municipal land use codes are assigned to initial three digit match (e.x. 101V - "Residential Vacant" or "Single Family Vacant" assigned to 101 - "Single Family"). UMDI allocates these to 131 - "Potentially Developable Land". Thoughts on how to handle these different instances?</w:t>
-      </w:r>
-    </w:p>
-    <w:p>
-      <w:pPr>
-        <w:numPr>
-          <w:ilvl w:val="0"/>
-          <w:numId w:val="3"/>
-        </w:numPr>
-      </w:pPr>
-      <w:r>
-        <w:t>"Office Condominiums" are a common use that are getting allocated to "Residential Condominiums". I feel this is easy enough to hard code (most already belong to the correct one digit code 1, 3, or 4).</w:t>
-      </w:r>
-    </w:p>
-    <w:p>
-      <w:pPr>
-        <w:numPr>
-          <w:ilvl w:val="0"/>
-          <w:numId w:val="3"/>
-        </w:numPr>
-      </w:pPr>
-      <w:r>
-        <w:t>A similar issue arises for "Developable", "Potentially Developable", and "Undevelopable" land. The one digit code usually gives it away; at times there is text that indicates whether its residential (e.x. "res"), commercial, or industrial. Given that there are typically clues, these don't fall into DLS duplicate territory, but I think its something to raise.</w:t>
-      </w:r>
-    </w:p>
-    <w:p>
-      <w:pPr>
-        <w:numPr>
-          <w:ilvl w:val="0"/>
-          <w:numId w:val="3"/>
-        </w:numPr>
-      </w:pPr>
-      <w:r>
-        <w:t>Reviewing codes with ADU indicators (e.x. "in-law") I found a few other terms that could be useful - "auxiliary" and "accessory". The latter is used elsewhere the list of standard codes (106 - "Accessory Land") so I won't use it.</w:t>
-      </w:r>
-    </w:p>
-    <w:p>
-      <w:r>
-        <w:t>Broke down the "Matched" records into two tables after putting them through the text analysis process: "matched_tbl" which is any initially matched code which at least one flag and "matched_unknown_tbl" which is any initially matched code without a flag (regardless of if its flagged for an "unknown" term).</w:t>
-      </w:r>
-      <w:r>
-        <w:br/>
-      </w:r>
-      <w:r>
-        <w:br/>
-        <w:t>Observations of "matched.unknown_tbl":</w:t>
-      </w:r>
-    </w:p>
-    <w:p>
-      <w:pPr>
-        <w:numPr>
-          <w:ilvl w:val="0"/>
-          <w:numId w:val="4"/>
-        </w:numPr>
-      </w:pPr>
-      <w:r>
-        <w:lastRenderedPageBreak/>
-        <w:t>Despite not being flagged, most of the codes are correctly assigned to a standard use code upon visual inspection.</w:t>
       </w:r>
     </w:p>
     <w:p>
@@ -446,7 +512,7 @@
         </w:numPr>
       </w:pPr>
       <w:r>
-        <w:t>No code for "Airport"</w:t>
+        <w:t>Many "PUB SCHOOL" use descriptions are matched to depricated exempt use codes. Where should they go?</w:t>
       </w:r>
     </w:p>
     <w:p>
@@ -457,7 +523,7 @@
         </w:numPr>
       </w:pPr>
       <w:r>
-        <w:t>Many municipalities continue to use depricated exempt codes. Where should they go?</w:t>
+        <w:t>Some "Ranch" use descriptions which are allocated to various standard codes. Believe this is describing type of building. Assume these should be assigned to whatever match is achieved through the initial three digit match.</w:t>
       </w:r>
     </w:p>
     <w:p>
@@ -468,28 +534,6 @@
         </w:numPr>
       </w:pPr>
       <w:r>
-        <w:t>Many "PUB SCHOOL" use descriptions are matched to depricated exempt use codes. Where should they go?</w:t>
-      </w:r>
-    </w:p>
-    <w:p>
-      <w:pPr>
-        <w:numPr>
-          <w:ilvl w:val="0"/>
-          <w:numId w:val="5"/>
-        </w:numPr>
-      </w:pPr>
-      <w:r>
-        <w:t>Some "Ranch" use descriptions which are allocated to various standard codes. Believe this is describing type of building. Assume these should be assigned to whatever match is achieved through the initial three digit match.</w:t>
-      </w:r>
-    </w:p>
-    <w:p>
-      <w:pPr>
-        <w:numPr>
-          <w:ilvl w:val="0"/>
-          <w:numId w:val="5"/>
-        </w:numPr>
-      </w:pPr>
-      <w:r>
         <w:t>Some "Other" and "Unknown" use descriptions have additional text which indicates general land use categories. They reasonably match to the use code assigned through the initial three digit match.</w:t>
       </w:r>
     </w:p>
@@ -523,28 +567,6 @@
       </w:pPr>
       <w:r>
         <w:t>Ignore "Ranch" - think this is fine.</w:t>
-      </w:r>
-    </w:p>
-    <w:p>
-      <w:pPr>
-        <w:numPr>
-          <w:ilvl w:val="0"/>
-          <w:numId w:val="7"/>
-        </w:numPr>
-      </w:pPr>
-      <w:r>
-        <w:t>Determine appropriate locations of specific deprecated exempt codes, crosswalk those municipal specific codes to the correct standard use code.</w:t>
-      </w:r>
-    </w:p>
-    <w:p>
-      <w:pPr>
-        <w:numPr>
-          <w:ilvl w:val="0"/>
-          <w:numId w:val="7"/>
-        </w:numPr>
-      </w:pPr>
-      <w:r>
-        <w:t>Separate records of "Other" and "Unknown" from records with those terms + other text. The latter group should be passed through assuming the match is good enough.</w:t>
       </w:r>
     </w:p>
     <w:p>
@@ -2204,6 +2226,7 @@
   <w:style w:type="character" w:default="1" w:styleId="DefaultParagraphFont">
     <w:name w:val="Default Paragraph Font"/>
     <w:uiPriority w:val="1"/>
+    <w:semiHidden/>
     <w:unhideWhenUsed/>
   </w:style>
   <w:style w:type="table" w:default="1" w:styleId="TableNormal">
@@ -2515,6 +2538,29 @@
       <w:smallCaps/>
       <w:color w:val="0F4761" w:themeColor="accent1" w:themeShade="BF"/>
       <w:spacing w:val="5"/>
+    </w:rPr>
+  </w:style>
+  <w:style w:type="character" w:styleId="Hyperlink">
+    <w:name w:val="Hyperlink"/>
+    <w:basedOn w:val="DefaultParagraphFont"/>
+    <w:uiPriority w:val="99"/>
+    <w:unhideWhenUsed/>
+    <w:rsid w:val="00355FCA"/>
+    <w:rPr>
+      <w:color w:val="467886" w:themeColor="hyperlink"/>
+      <w:u w:val="single"/>
+    </w:rPr>
+  </w:style>
+  <w:style w:type="character" w:styleId="UnresolvedMention">
+    <w:name w:val="Unresolved Mention"/>
+    <w:basedOn w:val="DefaultParagraphFont"/>
+    <w:uiPriority w:val="99"/>
+    <w:semiHidden/>
+    <w:unhideWhenUsed/>
+    <w:rsid w:val="00355FCA"/>
+    <w:rPr>
+      <w:color w:val="605E5C"/>
+      <w:shd w:val="clear" w:color="auto" w:fill="E1DFDD"/>
     </w:rPr>
   </w:style>
 </w:styles>

</xml_diff>